<commit_message>
docs(designer-kit): sơ đồ luồng gọn hơn + mô tả rõ trường hợp chưa có design system
- Vẽ lại flow-prototype-to-figma.png: 3 cột Đầu vào → Agent làm → Đầu ra
- Bước 4: 2 trường hợp — đã có file / chưa có file (link Figma cấu trúc design hoặc màn hình thực tế, AI tự tạo design system)
- Bước 7: cập nhật lựa chọn nguồn design system

Co-Authored-By: Claude Opus 5.5 <noreply@anthropic.com>
</commit_message>
<xml_diff>
--- a/designer-kit/prototype-to-figma/docs/Hướng dẫn sử dụng Prototype to Figma.docx
+++ b/designer-kit/prototype-to-figma/docs/Hướng dẫn sử dụng Prototype to Figma.docx
@@ -23,12 +23,6 @@
         <w:gridCol w:w="9746"/>
       </w:tblGrid>
       <w:tr>
-        <w:tblPrEx>
-          <w:tblCellMar>
-            <w:top w:w="0" w:type="dxa"/>
-            <w:bottom w:w="0" w:type="dxa"/>
-          </w:tblCellMar>
-        </w:tblPrEx>
         <w:tc>
           <w:tcPr>
             <w:tcW w:w="9746" w:type="dxa"/>
@@ -150,9 +144,9 @@
         </w:rPr>
         <w:drawing>
           <wp:inline distT="0" distB="0" distL="0" distR="0">
-            <wp:extent cx="6096000" cy="3657600"/>
+            <wp:extent cx="6096000" cy="3223846"/>
             <wp:effectExtent l="0" t="0" r="0" b="0"/>
-            <wp:docPr id="1" name="gen/flow.png" descr="Luồng tính năng — khung đỏ là chỗ Claude hỏi bạn; thiếu design system / prototype / link Figma thì dừng" title="Luồng tính năng — khung đỏ là chỗ Claude hỏi bạn; thiếu design system / prototype / link Figma thì dừng"/>
+            <wp:docPr id="1" name="gen/flow.png" descr="Luồng tính năng — chưa có design system thì chỉ cần link Figma, AI tự tạo · bạn duyệt 2 lần" title="Luồng tính năng — chưa có design system thì chỉ cần link Figma, AI tự tạo · bạn duyệt 2 lần"/>
             <wp:cNvGraphicFramePr>
               <a:graphicFrameLocks xmlns:a="http://schemas.openxmlformats.org/drawingml/2006/main" noChangeAspect="1"/>
             </wp:cNvGraphicFramePr>
@@ -175,7 +169,7 @@
                   <pic:spPr bwMode="auto">
                     <a:xfrm>
                       <a:off x="0" y="0"/>
-                      <a:ext cx="6096000" cy="3657600"/>
+                      <a:ext cx="6096000" cy="3223846"/>
                     </a:xfrm>
                     <a:prstGeom prst="rect">
                       <a:avLst/>
@@ -201,7 +195,7 @@
           <w:sz w:val="18"/>
           <w:szCs w:val="18"/>
         </w:rPr>
-        <w:t>Luồng tính năng — khung đỏ là chỗ Claude hỏi bạn; thiếu design system / prototype / link Figma thì dừng</w:t>
+        <w:t>Luồng tính năng — chưa có design system thì chỉ cần link Figma, AI tự tạo · bạn duyệt 2 lần</w:t>
       </w:r>
     </w:p>
     <w:tbl>
@@ -226,12 +220,6 @@
         <w:gridCol w:w="4873"/>
       </w:tblGrid>
       <w:tr>
-        <w:tblPrEx>
-          <w:tblCellMar>
-            <w:top w:w="0" w:type="dxa"/>
-            <w:bottom w:w="0" w:type="dxa"/>
-          </w:tblCellMar>
-        </w:tblPrEx>
         <w:tc>
           <w:tcPr>
             <w:tcW w:w="4873" w:type="dxa"/>
@@ -307,7 +295,7 @@
               <w:rPr>
                 <w:color w:val="24292F"/>
               </w:rPr>
-              <w:t>Design system của dự án: link Figma / tài liệu / 1–5 màn Figma đã duyệt</w:t>
+              <w:t>Design system: file có sẵn — hoặc chỉ cần link Figma (cấu trúc design / màn hình thực tế), AI tự tạo</w:t>
             </w:r>
           </w:p>
           <w:p>
@@ -485,12 +473,6 @@
         <w:gridCol w:w="9746"/>
       </w:tblGrid>
       <w:tr>
-        <w:tblPrEx>
-          <w:tblCellMar>
-            <w:top w:w="0" w:type="dxa"/>
-            <w:bottom w:w="0" w:type="dxa"/>
-          </w:tblCellMar>
-        </w:tblPrEx>
         <w:tc>
           <w:tcPr>
             <w:tcW w:w="9746" w:type="dxa"/>
@@ -581,12 +563,6 @@
         <w:gridCol w:w="9746"/>
       </w:tblGrid>
       <w:tr>
-        <w:tblPrEx>
-          <w:tblCellMar>
-            <w:top w:w="0" w:type="dxa"/>
-            <w:bottom w:w="0" w:type="dxa"/>
-          </w:tblCellMar>
-        </w:tblPrEx>
         <w:tc>
           <w:tcPr>
             <w:tcW w:w="9746" w:type="dxa"/>
@@ -616,7 +592,7 @@
                 <w:sz w:val="22"/>
                 <w:szCs w:val="22"/>
               </w:rPr>
-              <w:t>&lt;link Google Drive — sẽ cập nhật&gt;</w:t>
+              <w:t>https://drive.google.com/file/d/1-s4s7KKU1qWmRoFEeSK7Pd6trwH39GlB/view?usp=sharing</w:t>
             </w:r>
           </w:p>
         </w:tc>
@@ -883,12 +859,6 @@
         <w:gridCol w:w="9746"/>
       </w:tblGrid>
       <w:tr>
-        <w:tblPrEx>
-          <w:tblCellMar>
-            <w:top w:w="0" w:type="dxa"/>
-            <w:bottom w:w="0" w:type="dxa"/>
-          </w:tblCellMar>
-        </w:tblPrEx>
         <w:tc>
           <w:tcPr>
             <w:tcW w:w="9746" w:type="dxa"/>
@@ -1082,12 +1052,6 @@
         <w:gridCol w:w="9746"/>
       </w:tblGrid>
       <w:tr>
-        <w:tblPrEx>
-          <w:tblCellMar>
-            <w:top w:w="0" w:type="dxa"/>
-            <w:bottom w:w="0" w:type="dxa"/>
-          </w:tblCellMar>
-        </w:tblPrEx>
         <w:tc>
           <w:tcPr>
             <w:tcW w:w="9746" w:type="dxa"/>
@@ -1429,12 +1393,6 @@
         <w:gridCol w:w="9746"/>
       </w:tblGrid>
       <w:tr>
-        <w:tblPrEx>
-          <w:tblCellMar>
-            <w:top w:w="0" w:type="dxa"/>
-            <w:bottom w:w="0" w:type="dxa"/>
-          </w:tblCellMar>
-        </w:tblPrEx>
         <w:tc>
           <w:tcPr>
             <w:tcW w:w="9746" w:type="dxa"/>
@@ -1566,12 +1524,6 @@
         <w:gridCol w:w="9746"/>
       </w:tblGrid>
       <w:tr>
-        <w:tblPrEx>
-          <w:tblCellMar>
-            <w:top w:w="0" w:type="dxa"/>
-            <w:bottom w:w="0" w:type="dxa"/>
-          </w:tblCellMar>
-        </w:tblPrEx>
         <w:tc>
           <w:tcPr>
             <w:tcW w:w="9746" w:type="dxa"/>
@@ -1795,12 +1747,6 @@
         <w:gridCol w:w="9746"/>
       </w:tblGrid>
       <w:tr>
-        <w:tblPrEx>
-          <w:tblCellMar>
-            <w:top w:w="0" w:type="dxa"/>
-            <w:bottom w:w="0" w:type="dxa"/>
-          </w:tblCellMar>
-        </w:tblPrEx>
         <w:tc>
           <w:tcPr>
             <w:tcW w:w="9746" w:type="dxa"/>
@@ -1998,12 +1944,6 @@
         <w:gridCol w:w="9746"/>
       </w:tblGrid>
       <w:tr>
-        <w:tblPrEx>
-          <w:tblCellMar>
-            <w:top w:w="0" w:type="dxa"/>
-            <w:bottom w:w="0" w:type="dxa"/>
-          </w:tblCellMar>
-        </w:tblPrEx>
         <w:tc>
           <w:tcPr>
             <w:tcW w:w="9746" w:type="dxa"/>
@@ -2052,9 +1992,12 @@
       </w:pPr>
       <w:r>
         <w:rPr>
-          <w:color w:val="24292F"/>
-        </w:rPr>
-        <w:t>Design system là bộ quy định giao diện của dự án: màu sắc, font, size, weight, khoảng cách, bo góc, component. Agent chỉ vẽ khi có design system — để màn hình đúng thương hiệu dự án.</w:t>
+          <w:rFonts w:ascii="Calibri" w:cs="Calibri" w:eastAsia="Yu Gothic" w:hAnsi="Calibri"/>
+          <w:color w:val="24292F"/>
+          <w:sz w:val="20"/>
+          <w:szCs w:val="20"/>
+        </w:rPr>
+        <w:t xml:space="preserve">Design system là bộ quy định giao diện của dự án: màu sắc, font, size, weight, khoảng cách, bo góc, component. Agent chỉ vẽ khi có design system. </w:t>
       </w:r>
     </w:p>
     <w:p>
@@ -2068,17 +2011,23 @@
       </w:pPr>
       <w:r>
         <w:rPr>
+          <w:rFonts w:ascii="Calibri" w:cs="Calibri" w:eastAsia="Yu Gothic" w:hAnsi="Calibri"/>
           <w:b/>
           <w:bCs/>
           <w:color w:val="24292F"/>
-        </w:rPr>
-        <w:t>Có link Figma</w:t>
-      </w:r>
-      <w:r>
-        <w:rPr>
-          <w:color w:val="24292F"/>
-        </w:rPr>
-        <w:t xml:space="preserve"> (page Foundations / Design Tokens / Component Library) → copy link, sẽ dán khi Claude hỏi (Bước 7).</w:t>
+          <w:sz w:val="20"/>
+          <w:szCs w:val="20"/>
+        </w:rPr>
+        <w:t xml:space="preserve">Trường hợp 1 — Đã có file design system: </w:t>
+      </w:r>
+      <w:r>
+        <w:rPr>
+          <w:rFonts w:ascii="Calibri" w:cs="Calibri" w:eastAsia="Yu Gothic" w:hAnsi="Calibri"/>
+          <w:color w:val="24292F"/>
+          <w:sz w:val="20"/>
+          <w:szCs w:val="20"/>
+        </w:rPr>
+        <w:t xml:space="preserve">file .md / .pdf / .docx / .xlsx / ảnh → copy vào folder input/design-system (tự tạo nếu chưa có). Có link Design System artifact (claude.ai/artifact/…) thì dán khi Claude hỏi.</w:t>
       </w:r>
     </w:p>
     <w:p>
@@ -2092,58 +2041,52 @@
       </w:pPr>
       <w:r>
         <w:rPr>
+          <w:rFonts w:ascii="Calibri" w:cs="Calibri" w:eastAsia="Yu Gothic" w:hAnsi="Calibri"/>
           <w:b/>
           <w:bCs/>
-          <w:color w:val="24292F"/>
-        </w:rPr>
-        <w:t>Có tài liệu guideline</w:t>
-      </w:r>
-      <w:r>
-        <w:rPr>
-          <w:color w:val="24292F"/>
-        </w:rPr>
-        <w:t xml:space="preserve"> (.md / .pdf / .docx / ảnh) → copy vào folder </w:t>
-      </w:r>
-      <w:r>
-        <w:rPr>
-          <w:rFonts w:ascii="Consolas" w:eastAsia="MS Gothic" w:hAnsi="Consolas" w:cs="Consolas"/>
+          <w:color w:val="D86107"/>
+          <w:sz w:val="20"/>
+          <w:szCs w:val="20"/>
+        </w:rPr>
+        <w:t xml:space="preserve">Trường hợp 2 — Chưa có file design system: </w:t>
+      </w:r>
+      <w:r>
+        <w:rPr>
+          <w:rFonts w:ascii="Calibri" w:cs="Calibri" w:eastAsia="Yu Gothic" w:hAnsi="Calibri"/>
+          <w:color w:val="24292F"/>
+          <w:sz w:val="20"/>
+          <w:szCs w:val="20"/>
+        </w:rPr>
+        <w:t xml:space="preserve">chuẩn bị 1 trong 2 loại link Figma: (A) link Figma về cấu trúc design — page Foundations / Design Tokens / Component Library; hoặc (B) link Figma về màn hình thực tế — 1–5 màn đã được designer duyệt.</w:t>
+      </w:r>
+      <w:r>
+        <w:rPr>
+          <w:rFonts w:ascii="Calibri" w:cs="Calibri" w:eastAsia="Yu Gothic" w:hAnsi="Calibri"/>
+          <w:color w:val="24292F"/>
+          <w:sz w:val="20"/>
+          <w:szCs w:val="20"/>
+        </w:rPr>
+        <w:t xml:space="preserve"> → AI tự đọc link Figma, đo màu, chữ, khoảng cách, component và </w:t>
+      </w:r>
+      <w:r>
+        <w:rPr>
+          <w:rFonts w:ascii="Calibri" w:cs="Calibri" w:eastAsia="Yu Gothic" w:hAnsi="Calibri"/>
           <w:b/>
           <w:bCs/>
-          <w:color w:val="0969DA"/>
-          <w:sz w:val="19"/>
-          <w:szCs w:val="19"/>
-        </w:rPr>
-        <w:t>input/design-system</w:t>
-      </w:r>
-      <w:r>
-        <w:rPr>
-          <w:color w:val="24292F"/>
-        </w:rPr>
-        <w:t xml:space="preserve"> (tự tạo folder nếu chưa có).</w:t>
-      </w:r>
-    </w:p>
-    <w:p>
-      <w:pPr>
-        <w:pStyle w:val="ListParagraph"/>
-        <w:numPr>
-          <w:ilvl w:val="0"/>
-          <w:numId w:val="7"/>
-        </w:numPr>
-        <w:spacing w:before="20" w:after="20"/>
-      </w:pPr>
-      <w:r>
-        <w:rPr>
-          <w:b/>
-          <w:bCs/>
-          <w:color w:val="24292F"/>
-        </w:rPr>
-        <w:t>Chỉ có vài màn Figma đã duyệt</w:t>
-      </w:r>
-      <w:r>
-        <w:rPr>
-          <w:color w:val="24292F"/>
-        </w:rPr>
-        <w:t xml:space="preserve"> → chuẩn bị 1–5 link màn hình. Agent sẽ tự đọc, phân tích và dựng design system.</w:t>
+          <w:color w:val="24292F"/>
+          <w:sz w:val="20"/>
+          <w:szCs w:val="20"/>
+        </w:rPr>
+        <w:t xml:space="preserve">tạo ra design system cho dự án</w:t>
+      </w:r>
+      <w:r>
+        <w:rPr>
+          <w:rFonts w:ascii="Calibri" w:cs="Calibri" w:eastAsia="Yu Gothic" w:hAnsi="Calibri"/>
+          <w:color w:val="24292F"/>
+          <w:sz w:val="20"/>
+          <w:szCs w:val="20"/>
+        </w:rPr>
+        <w:t xml:space="preserve"> — bạn chỉ cần duyệt.</w:t>
       </w:r>
     </w:p>
     <w:p>
@@ -2173,12 +2116,6 @@
         <w:gridCol w:w="9746"/>
       </w:tblGrid>
       <w:tr>
-        <w:tblPrEx>
-          <w:tblCellMar>
-            <w:top w:w="0" w:type="dxa"/>
-            <w:bottom w:w="0" w:type="dxa"/>
-          </w:tblCellMar>
-        </w:tblPrEx>
         <w:tc>
           <w:tcPr>
             <w:tcW w:w="9746" w:type="dxa"/>
@@ -2210,17 +2147,9 @@
             </w:r>
             <w:r>
               <w:rPr>
-                <w:b/>
-                <w:bCs/>
                 <w:color w:val="24292F"/>
               </w:rPr>
-              <w:t xml:space="preserve">Chưa có gì cả → agent sẽ DỪNG, không vẽ. </w:t>
-            </w:r>
-            <w:r>
-              <w:rPr>
-                <w:color w:val="24292F"/>
-              </w:rPr>
-              <w:t>Liên hệ designer / leader dự án để lấy 1 trong 3 nguồn trên rồi chạy lại.</w:t>
+              <w:t xml:space="preserve">Không có file và cũng không có link Figma nào → agent sẽ DỪNG, không vẽ. Xin designer / leader dự án 1 link Figma rồi chạy lại.</w:t>
             </w:r>
           </w:p>
         </w:tc>
@@ -2253,12 +2182,6 @@
         <w:gridCol w:w="9746"/>
       </w:tblGrid>
       <w:tr>
-        <w:tblPrEx>
-          <w:tblCellMar>
-            <w:top w:w="0" w:type="dxa"/>
-            <w:bottom w:w="0" w:type="dxa"/>
-          </w:tblCellMar>
-        </w:tblPrEx>
         <w:tc>
           <w:tcPr>
             <w:tcW w:w="9746" w:type="dxa"/>
@@ -2292,24 +2215,7 @@
               <w:rPr>
                 <w:color w:val="24292F"/>
               </w:rPr>
-              <w:t xml:space="preserve">Lần đầu agent dựng folder </w:t>
-            </w:r>
-            <w:r>
-              <w:rPr>
-                <w:rFonts w:ascii="Consolas" w:eastAsia="MS Gothic" w:hAnsi="Consolas" w:cs="Consolas"/>
-                <w:b/>
-                <w:bCs/>
-                <w:color w:val="0969DA"/>
-                <w:sz w:val="19"/>
-                <w:szCs w:val="19"/>
-              </w:rPr>
-              <w:t>design-system</w:t>
-            </w:r>
-            <w:r>
-              <w:rPr>
-                <w:color w:val="24292F"/>
-              </w:rPr>
-              <w:t xml:space="preserve"> và nhờ bạn duyệt. Các lần sau dùng lại luôn, không hỏi lại.</w:t>
+              <w:t xml:space="preserve">Lần đầu agent tạo Design System (1 link artifact + folder design-system) và nhờ bạn duyệt. Các lần sau dùng lại luôn, không hỏi lại.</w:t>
             </w:r>
           </w:p>
         </w:tc>
@@ -2326,7 +2232,7 @@
         </w:rPr>
         <w:drawing>
           <wp:inline distT="0" distB="0" distL="0" distR="0">
-            <wp:extent cx="5905500" cy="2952750"/>
+            <wp:extent cx="5905500" cy="2944313"/>
             <wp:effectExtent l="0" t="0" r="0" b="0"/>
             <wp:docPr id="6" name="gen/s_ds.png" descr="Hình minh họa — Bước 4" title="Hình minh họa — Bước 4"/>
             <wp:cNvGraphicFramePr>
@@ -2351,7 +2257,7 @@
                   <pic:spPr bwMode="auto">
                     <a:xfrm>
                       <a:off x="0" y="0"/>
-                      <a:ext cx="5905500" cy="2952750"/>
+                      <a:ext cx="5905500" cy="2944313"/>
                     </a:xfrm>
                     <a:prstGeom prst="rect">
                       <a:avLst/>
@@ -2407,12 +2313,6 @@
         <w:gridCol w:w="9746"/>
       </w:tblGrid>
       <w:tr>
-        <w:tblPrEx>
-          <w:tblCellMar>
-            <w:top w:w="0" w:type="dxa"/>
-            <w:bottom w:w="0" w:type="dxa"/>
-          </w:tblCellMar>
-        </w:tblPrEx>
         <w:tc>
           <w:tcPr>
             <w:tcW w:w="9746" w:type="dxa"/>
@@ -2592,12 +2492,6 @@
         <w:gridCol w:w="9746"/>
       </w:tblGrid>
       <w:tr>
-        <w:tblPrEx>
-          <w:tblCellMar>
-            <w:top w:w="0" w:type="dxa"/>
-            <w:bottom w:w="0" w:type="dxa"/>
-          </w:tblCellMar>
-        </w:tblPrEx>
         <w:tc>
           <w:tcPr>
             <w:tcW w:w="9746" w:type="dxa"/>
@@ -2730,12 +2624,6 @@
         <w:gridCol w:w="9746"/>
       </w:tblGrid>
       <w:tr>
-        <w:tblPrEx>
-          <w:tblCellMar>
-            <w:top w:w="0" w:type="dxa"/>
-            <w:bottom w:w="0" w:type="dxa"/>
-          </w:tblCellMar>
-        </w:tblPrEx>
         <w:tc>
           <w:tcPr>
             <w:tcW w:w="9746" w:type="dxa"/>
@@ -2810,12 +2698,6 @@
         <w:gridCol w:w="9746"/>
       </w:tblGrid>
       <w:tr>
-        <w:tblPrEx>
-          <w:tblCellMar>
-            <w:top w:w="0" w:type="dxa"/>
-            <w:bottom w:w="0" w:type="dxa"/>
-          </w:tblCellMar>
-        </w:tblPrEx>
         <w:tc>
           <w:tcPr>
             <w:tcW w:w="9746" w:type="dxa"/>
@@ -2893,12 +2775,6 @@
         <w:gridCol w:w="9746"/>
       </w:tblGrid>
       <w:tr>
-        <w:tblPrEx>
-          <w:tblCellMar>
-            <w:top w:w="0" w:type="dxa"/>
-            <w:bottom w:w="0" w:type="dxa"/>
-          </w:tblCellMar>
-        </w:tblPrEx>
         <w:tc>
           <w:tcPr>
             <w:tcW w:w="9746" w:type="dxa"/>
@@ -2976,12 +2852,6 @@
         <w:gridCol w:w="9746"/>
       </w:tblGrid>
       <w:tr>
-        <w:tblPrEx>
-          <w:tblCellMar>
-            <w:top w:w="0" w:type="dxa"/>
-            <w:bottom w:w="0" w:type="dxa"/>
-          </w:tblCellMar>
-        </w:tblPrEx>
         <w:tc>
           <w:tcPr>
             <w:tcW w:w="9746" w:type="dxa"/>
@@ -3059,12 +2929,6 @@
         <w:gridCol w:w="9746"/>
       </w:tblGrid>
       <w:tr>
-        <w:tblPrEx>
-          <w:tblCellMar>
-            <w:top w:w="0" w:type="dxa"/>
-            <w:bottom w:w="0" w:type="dxa"/>
-          </w:tblCellMar>
-        </w:tblPrEx>
         <w:tc>
           <w:tcPr>
             <w:tcW w:w="9746" w:type="dxa"/>
@@ -3197,12 +3061,6 @@
         <w:gridCol w:w="9746"/>
       </w:tblGrid>
       <w:tr>
-        <w:tblPrEx>
-          <w:tblCellMar>
-            <w:top w:w="0" w:type="dxa"/>
-            <w:bottom w:w="0" w:type="dxa"/>
-          </w:tblCellMar>
-        </w:tblPrEx>
         <w:tc>
           <w:tcPr>
             <w:tcW w:w="9746" w:type="dxa"/>
@@ -3278,12 +3136,6 @@
         <w:gridCol w:w="6846"/>
       </w:tblGrid>
       <w:tr>
-        <w:tblPrEx>
-          <w:tblCellMar>
-            <w:top w:w="0" w:type="dxa"/>
-            <w:bottom w:w="0" w:type="dxa"/>
-          </w:tblCellMar>
-        </w:tblPrEx>
         <w:tc>
           <w:tcPr>
             <w:tcW w:w="2900" w:type="dxa"/>
@@ -3348,12 +3200,6 @@
         </w:tc>
       </w:tr>
       <w:tr>
-        <w:tblPrEx>
-          <w:tblCellMar>
-            <w:top w:w="0" w:type="dxa"/>
-            <w:bottom w:w="0" w:type="dxa"/>
-          </w:tblCellMar>
-        </w:tblPrEx>
         <w:tc>
           <w:tcPr>
             <w:tcW w:w="2900" w:type="dxa"/>
@@ -3408,18 +3254,12 @@
               <w:rPr>
                 <w:color w:val="24292F"/>
               </w:rPr>
-              <w:t>Link Figma design system · File tài liệu · Đã có trong design-system/ · Chưa có (→ Claude dừng)</w:t>
+              <w:t xml:space="preserve">Link Figma (cấu trúc design hoặc màn hình thực tế) · File tài liệu · Link artifact Design System · Chưa có (→ Claude dừng)</w:t>
             </w:r>
           </w:p>
         </w:tc>
       </w:tr>
       <w:tr>
-        <w:tblPrEx>
-          <w:tblCellMar>
-            <w:top w:w="0" w:type="dxa"/>
-            <w:bottom w:w="0" w:type="dxa"/>
-          </w:tblCellMar>
-        </w:tblPrEx>
         <w:tc>
           <w:tcPr>
             <w:tcW w:w="2900" w:type="dxa"/>
@@ -3480,12 +3320,6 @@
         </w:tc>
       </w:tr>
       <w:tr>
-        <w:tblPrEx>
-          <w:tblCellMar>
-            <w:top w:w="0" w:type="dxa"/>
-            <w:bottom w:w="0" w:type="dxa"/>
-          </w:tblCellMar>
-        </w:tblPrEx>
         <w:tc>
           <w:tcPr>
             <w:tcW w:w="2900" w:type="dxa"/>
@@ -3540,18 +3374,12 @@
               <w:rPr>
                 <w:color w:val="24292F"/>
               </w:rPr>
-              <w:t>Claude tóm tắt màu, font, component, platform → Duyệt · Sửa</w:t>
+              <w:t xml:space="preserve">Claude gửi link Design System + tóm tắt màu, font, component → Duyệt · Sửa</w:t>
             </w:r>
           </w:p>
         </w:tc>
       </w:tr>
       <w:tr>
-        <w:tblPrEx>
-          <w:tblCellMar>
-            <w:top w:w="0" w:type="dxa"/>
-            <w:bottom w:w="0" w:type="dxa"/>
-          </w:tblCellMar>
-        </w:tblPrEx>
         <w:tc>
           <w:tcPr>
             <w:tcW w:w="2900" w:type="dxa"/>
@@ -3612,12 +3440,6 @@
         </w:tc>
       </w:tr>
       <w:tr>
-        <w:tblPrEx>
-          <w:tblCellMar>
-            <w:top w:w="0" w:type="dxa"/>
-            <w:bottom w:w="0" w:type="dxa"/>
-          </w:tblCellMar>
-        </w:tblPrEx>
         <w:tc>
           <w:tcPr>
             <w:tcW w:w="2900" w:type="dxa"/>
@@ -3678,12 +3500,6 @@
         </w:tc>
       </w:tr>
       <w:tr>
-        <w:tblPrEx>
-          <w:tblCellMar>
-            <w:top w:w="0" w:type="dxa"/>
-            <w:bottom w:w="0" w:type="dxa"/>
-          </w:tblCellMar>
-        </w:tblPrEx>
         <w:tc>
           <w:tcPr>
             <w:tcW w:w="2900" w:type="dxa"/>
@@ -3744,12 +3560,6 @@
         </w:tc>
       </w:tr>
       <w:tr>
-        <w:tblPrEx>
-          <w:tblCellMar>
-            <w:top w:w="0" w:type="dxa"/>
-            <w:bottom w:w="0" w:type="dxa"/>
-          </w:tblCellMar>
-        </w:tblPrEx>
         <w:tc>
           <w:tcPr>
             <w:tcW w:w="2900" w:type="dxa"/>
@@ -3810,12 +3620,6 @@
         </w:tc>
       </w:tr>
       <w:tr>
-        <w:tblPrEx>
-          <w:tblCellMar>
-            <w:top w:w="0" w:type="dxa"/>
-            <w:bottom w:w="0" w:type="dxa"/>
-          </w:tblCellMar>
-        </w:tblPrEx>
         <w:tc>
           <w:tcPr>
             <w:tcW w:w="2900" w:type="dxa"/>
@@ -4053,12 +3857,6 @@
         <w:gridCol w:w="9746"/>
       </w:tblGrid>
       <w:tr>
-        <w:tblPrEx>
-          <w:tblCellMar>
-            <w:top w:w="0" w:type="dxa"/>
-            <w:bottom w:w="0" w:type="dxa"/>
-          </w:tblCellMar>
-        </w:tblPrEx>
         <w:tc>
           <w:tcPr>
             <w:tcW w:w="9746" w:type="dxa"/>
@@ -4285,12 +4083,6 @@
         <w:gridCol w:w="9746"/>
       </w:tblGrid>
       <w:tr>
-        <w:tblPrEx>
-          <w:tblCellMar>
-            <w:top w:w="0" w:type="dxa"/>
-            <w:bottom w:w="0" w:type="dxa"/>
-          </w:tblCellMar>
-        </w:tblPrEx>
         <w:tc>
           <w:tcPr>
             <w:tcW w:w="9746" w:type="dxa"/>
@@ -4415,12 +4207,6 @@
         <w:gridCol w:w="9746"/>
       </w:tblGrid>
       <w:tr>
-        <w:tblPrEx>
-          <w:tblCellMar>
-            <w:top w:w="0" w:type="dxa"/>
-            <w:bottom w:w="0" w:type="dxa"/>
-          </w:tblCellMar>
-        </w:tblPrEx>
         <w:tc>
           <w:tcPr>
             <w:tcW w:w="9746" w:type="dxa"/>
@@ -4498,12 +4284,6 @@
         <w:gridCol w:w="9746"/>
       </w:tblGrid>
       <w:tr>
-        <w:tblPrEx>
-          <w:tblCellMar>
-            <w:top w:w="0" w:type="dxa"/>
-            <w:bottom w:w="0" w:type="dxa"/>
-          </w:tblCellMar>
-        </w:tblPrEx>
         <w:tc>
           <w:tcPr>
             <w:tcW w:w="9746" w:type="dxa"/>
@@ -4579,12 +4359,6 @@
         <w:gridCol w:w="9746"/>
       </w:tblGrid>
       <w:tr>
-        <w:tblPrEx>
-          <w:tblCellMar>
-            <w:top w:w="0" w:type="dxa"/>
-            <w:bottom w:w="0" w:type="dxa"/>
-          </w:tblCellMar>
-        </w:tblPrEx>
         <w:tc>
           <w:tcPr>
             <w:tcW w:w="9746" w:type="dxa"/>
@@ -4662,12 +4436,6 @@
         <w:gridCol w:w="9746"/>
       </w:tblGrid>
       <w:tr>
-        <w:tblPrEx>
-          <w:tblCellMar>
-            <w:top w:w="0" w:type="dxa"/>
-            <w:bottom w:w="0" w:type="dxa"/>
-          </w:tblCellMar>
-        </w:tblPrEx>
         <w:tc>
           <w:tcPr>
             <w:tcW w:w="9746" w:type="dxa"/>
@@ -4733,12 +4501,6 @@
         <w:gridCol w:w="9746"/>
       </w:tblGrid>
       <w:tr>
-        <w:tblPrEx>
-          <w:tblCellMar>
-            <w:top w:w="0" w:type="dxa"/>
-            <w:bottom w:w="0" w:type="dxa"/>
-          </w:tblCellMar>
-        </w:tblPrEx>
         <w:tc>
           <w:tcPr>
             <w:tcW w:w="9746" w:type="dxa"/>
@@ -4823,12 +4585,6 @@
         <w:gridCol w:w="3646"/>
       </w:tblGrid>
       <w:tr>
-        <w:tblPrEx>
-          <w:tblCellMar>
-            <w:top w:w="0" w:type="dxa"/>
-            <w:bottom w:w="0" w:type="dxa"/>
-          </w:tblCellMar>
-        </w:tblPrEx>
         <w:trPr>
           <w:tblHeader/>
         </w:trPr>
@@ -4958,12 +4714,6 @@
         </w:tc>
       </w:tr>
       <w:tr>
-        <w:tblPrEx>
-          <w:tblCellMar>
-            <w:top w:w="0" w:type="dxa"/>
-            <w:bottom w:w="0" w:type="dxa"/>
-          </w:tblCellMar>
-        </w:tblPrEx>
         <w:tc>
           <w:tcPr>
             <w:tcW w:w="600" w:type="dxa"/>
@@ -5084,12 +4834,6 @@
         </w:tc>
       </w:tr>
       <w:tr>
-        <w:tblPrEx>
-          <w:tblCellMar>
-            <w:top w:w="0" w:type="dxa"/>
-            <w:bottom w:w="0" w:type="dxa"/>
-          </w:tblCellMar>
-        </w:tblPrEx>
         <w:tc>
           <w:tcPr>
             <w:tcW w:w="600" w:type="dxa"/>
@@ -5210,12 +4954,6 @@
         </w:tc>
       </w:tr>
       <w:tr>
-        <w:tblPrEx>
-          <w:tblCellMar>
-            <w:top w:w="0" w:type="dxa"/>
-            <w:bottom w:w="0" w:type="dxa"/>
-          </w:tblCellMar>
-        </w:tblPrEx>
         <w:tc>
           <w:tcPr>
             <w:tcW w:w="600" w:type="dxa"/>
@@ -5336,12 +5074,6 @@
         </w:tc>
       </w:tr>
       <w:tr>
-        <w:tblPrEx>
-          <w:tblCellMar>
-            <w:top w:w="0" w:type="dxa"/>
-            <w:bottom w:w="0" w:type="dxa"/>
-          </w:tblCellMar>
-        </w:tblPrEx>
         <w:tc>
           <w:tcPr>
             <w:tcW w:w="600" w:type="dxa"/>
@@ -6127,12 +5859,6 @@
         <w:gridCol w:w="9746"/>
       </w:tblGrid>
       <w:tr>
-        <w:tblPrEx>
-          <w:tblCellMar>
-            <w:top w:w="0" w:type="dxa"/>
-            <w:bottom w:w="0" w:type="dxa"/>
-          </w:tblCellMar>
-        </w:tblPrEx>
         <w:tc>
           <w:tcPr>
             <w:tcW w:w="9746" w:type="dxa"/>

</xml_diff>